<commit_message>
Phase 2 setup + project status tracking: GENROU model, foundations, PSSE Phase 1, status tables
</commit_message>
<xml_diff>
--- a/SMIB_Master_Plan.docx
+++ b/SMIB_Master_Plan.docx
@@ -2352,6 +2352,1145 @@
         </w:tc>
       </w:tr>
     </w:tbl>
+    <w:p>
+      <w:pPr>
+        <w:pStyle w:val="Heading3"/>
+        <w:spacing w:after="100" w:before="200"/>
+      </w:pPr>
+      <w:r>
+        <w:rPr>
+          <w:rFonts w:ascii="Arial" w:cs="Arial" w:eastAsia="Arial" w:hAnsi="Arial"/>
+          <w:b/>
+          <w:bCs/>
+          <w:sz w:val="24"/>
+          <w:szCs w:val="24"/>
+        </w:rPr>
+        <w:t xml:space="preserve">Current project status</w:t>
+      </w:r>
+    </w:p>
+    <w:p>
+      <w:pPr>
+        <w:spacing w:after="120"/>
+      </w:pPr>
+      <w:r>
+        <w:rPr>
+          <w:rFonts w:ascii="Arial" w:cs="Arial" w:eastAsia="Arial" w:hAnsi="Arial"/>
+          <w:b w:val="false"/>
+          <w:bCs w:val="false"/>
+          <w:i w:val="false"/>
+          <w:iCs w:val="false"/>
+          <w:sz w:val="22"/>
+          <w:szCs w:val="22"/>
+        </w:rPr>
+        <w:t xml:space="preserve">Updated as phases land. As of the latest build, Phase 1 is fully shipped (model + tests + notebook + PSSE benchmark), and Phase 2 is in flight at sub-increment 2.0 (GENROU bare). The four sub-phases of Phase 2 land independently, each adding one controller on top of the round-rotor machine.</w:t>
+      </w:r>
+    </w:p>
+    <w:tbl>
+      <w:tblPr>
+        <w:tblW w:type="dxa" w:w="9360"/>
+        <w:tblBorders>
+          <w:top w:val="single" w:color="auto" w:sz="4"/>
+          <w:left w:val="single" w:color="auto" w:sz="4"/>
+          <w:bottom w:val="single" w:color="auto" w:sz="4"/>
+          <w:right w:val="single" w:color="auto" w:sz="4"/>
+          <w:insideH w:val="single" w:color="auto" w:sz="4"/>
+          <w:insideV w:val="single" w:color="auto" w:sz="4"/>
+        </w:tblBorders>
+      </w:tblPr>
+      <w:tblGrid>
+        <w:gridCol w:w="3120"/>
+        <w:gridCol w:w="3120"/>
+        <w:gridCol w:w="3120"/>
+      </w:tblGrid>
+      <w:tr>
+        <w:tc>
+          <w:tcPr>
+            <w:tcW w:type="dxa" w:w="3120"/>
+            <w:tcBorders>
+              <w:top w:val="single" w:color="BBBBBB" w:sz="4"/>
+              <w:left w:val="single" w:color="BBBBBB" w:sz="4"/>
+              <w:bottom w:val="single" w:color="BBBBBB" w:sz="4"/>
+              <w:right w:val="single" w:color="BBBBBB" w:sz="4"/>
+            </w:tcBorders>
+            <w:shd w:fill="D9E2F3" w:val="clear"/>
+            <w:tcMar>
+              <w:top w:type="dxa" w:w="80"/>
+              <w:left w:type="dxa" w:w="120"/>
+              <w:bottom w:type="dxa" w:w="80"/>
+              <w:right w:type="dxa" w:w="120"/>
+            </w:tcMar>
+          </w:tcPr>
+          <w:p>
+            <w:r>
+              <w:rPr>
+                <w:rFonts w:ascii="Arial" w:cs="Arial" w:eastAsia="Arial" w:hAnsi="Arial"/>
+                <w:b/>
+                <w:bCs/>
+                <w:sz w:val="20"/>
+                <w:szCs w:val="20"/>
+              </w:rPr>
+              <w:t xml:space="preserve">Phase</w:t>
+            </w:r>
+          </w:p>
+        </w:tc>
+        <w:tc>
+          <w:tcPr>
+            <w:tcW w:type="dxa" w:w="3120"/>
+            <w:tcBorders>
+              <w:top w:val="single" w:color="BBBBBB" w:sz="4"/>
+              <w:left w:val="single" w:color="BBBBBB" w:sz="4"/>
+              <w:bottom w:val="single" w:color="BBBBBB" w:sz="4"/>
+              <w:right w:val="single" w:color="BBBBBB" w:sz="4"/>
+            </w:tcBorders>
+            <w:shd w:fill="D9E2F3" w:val="clear"/>
+            <w:tcMar>
+              <w:top w:type="dxa" w:w="80"/>
+              <w:left w:type="dxa" w:w="120"/>
+              <w:bottom w:type="dxa" w:w="80"/>
+              <w:right w:type="dxa" w:w="120"/>
+            </w:tcMar>
+          </w:tcPr>
+          <w:p>
+            <w:r>
+              <w:rPr>
+                <w:rFonts w:ascii="Arial" w:cs="Arial" w:eastAsia="Arial" w:hAnsi="Arial"/>
+                <w:b/>
+                <w:bCs/>
+                <w:sz w:val="20"/>
+                <w:szCs w:val="20"/>
+              </w:rPr>
+              <w:t xml:space="preserve">Status</w:t>
+            </w:r>
+          </w:p>
+        </w:tc>
+        <w:tc>
+          <w:tcPr>
+            <w:tcW w:type="dxa" w:w="3120"/>
+            <w:tcBorders>
+              <w:top w:val="single" w:color="BBBBBB" w:sz="4"/>
+              <w:left w:val="single" w:color="BBBBBB" w:sz="4"/>
+              <w:bottom w:val="single" w:color="BBBBBB" w:sz="4"/>
+              <w:right w:val="single" w:color="BBBBBB" w:sz="4"/>
+            </w:tcBorders>
+            <w:shd w:fill="D9E2F3" w:val="clear"/>
+            <w:tcMar>
+              <w:top w:type="dxa" w:w="80"/>
+              <w:left w:type="dxa" w:w="120"/>
+              <w:bottom w:type="dxa" w:w="80"/>
+              <w:right w:type="dxa" w:w="120"/>
+            </w:tcMar>
+          </w:tcPr>
+          <w:p>
+            <w:r>
+              <w:rPr>
+                <w:rFonts w:ascii="Arial" w:cs="Arial" w:eastAsia="Arial" w:hAnsi="Arial"/>
+                <w:b/>
+                <w:bCs/>
+                <w:sz w:val="20"/>
+                <w:szCs w:val="20"/>
+              </w:rPr>
+              <w:t xml:space="preserve">What "done" means</w:t>
+            </w:r>
+          </w:p>
+        </w:tc>
+      </w:tr>
+      <w:tr>
+        <w:tc>
+          <w:tcPr>
+            <w:tcW w:type="dxa" w:w="3120"/>
+            <w:tcBorders>
+              <w:top w:val="single" w:color="BBBBBB" w:sz="4"/>
+              <w:left w:val="single" w:color="BBBBBB" w:sz="4"/>
+              <w:bottom w:val="single" w:color="BBBBBB" w:sz="4"/>
+              <w:right w:val="single" w:color="BBBBBB" w:sz="4"/>
+            </w:tcBorders>
+            <w:tcMar>
+              <w:top w:type="dxa" w:w="80"/>
+              <w:left w:type="dxa" w:w="120"/>
+              <w:bottom w:type="dxa" w:w="80"/>
+              <w:right w:type="dxa" w:w="120"/>
+            </w:tcMar>
+          </w:tcPr>
+          <w:p>
+            <w:r>
+              <w:rPr>
+                <w:rFonts w:ascii="Arial" w:cs="Arial" w:eastAsia="Arial" w:hAnsi="Arial"/>
+                <w:b w:val="false"/>
+                <w:bCs w:val="false"/>
+                <w:sz w:val="20"/>
+                <w:szCs w:val="20"/>
+              </w:rPr>
+              <w:t xml:space="preserve">0. Scaffold</w:t>
+            </w:r>
+          </w:p>
+        </w:tc>
+        <w:tc>
+          <w:tcPr>
+            <w:tcW w:type="dxa" w:w="3120"/>
+            <w:tcBorders>
+              <w:top w:val="single" w:color="BBBBBB" w:sz="4"/>
+              <w:left w:val="single" w:color="BBBBBB" w:sz="4"/>
+              <w:bottom w:val="single" w:color="BBBBBB" w:sz="4"/>
+              <w:right w:val="single" w:color="BBBBBB" w:sz="4"/>
+            </w:tcBorders>
+            <w:tcMar>
+              <w:top w:type="dxa" w:w="80"/>
+              <w:left w:type="dxa" w:w="120"/>
+              <w:bottom w:type="dxa" w:w="80"/>
+              <w:right w:type="dxa" w:w="120"/>
+            </w:tcMar>
+          </w:tcPr>
+          <w:p>
+            <w:r>
+              <w:rPr>
+                <w:rFonts w:ascii="Arial" w:cs="Arial" w:eastAsia="Arial" w:hAnsi="Arial"/>
+                <w:b w:val="false"/>
+                <w:bCs w:val="false"/>
+                <w:sz w:val="20"/>
+                <w:szCs w:val="20"/>
+              </w:rPr>
+              <w:t xml:space="preserve">DONE</w:t>
+            </w:r>
+          </w:p>
+        </w:tc>
+        <w:tc>
+          <w:tcPr>
+            <w:tcW w:type="dxa" w:w="3120"/>
+            <w:tcBorders>
+              <w:top w:val="single" w:color="BBBBBB" w:sz="4"/>
+              <w:left w:val="single" w:color="BBBBBB" w:sz="4"/>
+              <w:bottom w:val="single" w:color="BBBBBB" w:sz="4"/>
+              <w:right w:val="single" w:color="BBBBBB" w:sz="4"/>
+            </w:tcBorders>
+            <w:tcMar>
+              <w:top w:type="dxa" w:w="80"/>
+              <w:left w:type="dxa" w:w="120"/>
+              <w:bottom w:type="dxa" w:w="80"/>
+              <w:right w:type="dxa" w:w="120"/>
+            </w:tcMar>
+          </w:tcPr>
+          <w:p>
+            <w:r>
+              <w:rPr>
+                <w:rFonts w:ascii="Arial" w:cs="Arial" w:eastAsia="Arial" w:hAnsi="Arial"/>
+                <w:b w:val="false"/>
+                <w:bCs w:val="false"/>
+                <w:sz w:val="20"/>
+                <w:szCs w:val="20"/>
+              </w:rPr>
+              <w:t xml:space="preserve">Repo skeleton, solver, network, PF, scenarios, plotting, base tests.</w:t>
+            </w:r>
+          </w:p>
+        </w:tc>
+      </w:tr>
+      <w:tr>
+        <w:tc>
+          <w:tcPr>
+            <w:tcW w:type="dxa" w:w="3120"/>
+            <w:tcBorders>
+              <w:top w:val="single" w:color="BBBBBB" w:sz="4"/>
+              <w:left w:val="single" w:color="BBBBBB" w:sz="4"/>
+              <w:bottom w:val="single" w:color="BBBBBB" w:sz="4"/>
+              <w:right w:val="single" w:color="BBBBBB" w:sz="4"/>
+            </w:tcBorders>
+            <w:tcMar>
+              <w:top w:type="dxa" w:w="80"/>
+              <w:left w:type="dxa" w:w="120"/>
+              <w:bottom w:type="dxa" w:w="80"/>
+              <w:right w:type="dxa" w:w="120"/>
+            </w:tcMar>
+          </w:tcPr>
+          <w:p>
+            <w:r>
+              <w:rPr>
+                <w:rFonts w:ascii="Arial" w:cs="Arial" w:eastAsia="Arial" w:hAnsi="Arial"/>
+                <w:b w:val="false"/>
+                <w:bCs w:val="false"/>
+                <w:sz w:val="20"/>
+                <w:szCs w:val="20"/>
+              </w:rPr>
+              <w:t xml:space="preserve">1. GENCLS</w:t>
+            </w:r>
+          </w:p>
+        </w:tc>
+        <w:tc>
+          <w:tcPr>
+            <w:tcW w:type="dxa" w:w="3120"/>
+            <w:tcBorders>
+              <w:top w:val="single" w:color="BBBBBB" w:sz="4"/>
+              <w:left w:val="single" w:color="BBBBBB" w:sz="4"/>
+              <w:bottom w:val="single" w:color="BBBBBB" w:sz="4"/>
+              <w:right w:val="single" w:color="BBBBBB" w:sz="4"/>
+            </w:tcBorders>
+            <w:tcMar>
+              <w:top w:type="dxa" w:w="80"/>
+              <w:left w:type="dxa" w:w="120"/>
+              <w:bottom w:type="dxa" w:w="80"/>
+              <w:right w:type="dxa" w:w="120"/>
+            </w:tcMar>
+          </w:tcPr>
+          <w:p>
+            <w:r>
+              <w:rPr>
+                <w:rFonts w:ascii="Arial" w:cs="Arial" w:eastAsia="Arial" w:hAnsi="Arial"/>
+                <w:b w:val="false"/>
+                <w:bCs w:val="false"/>
+                <w:sz w:val="20"/>
+                <w:szCs w:val="20"/>
+              </w:rPr>
+              <w:t xml:space="preserve">DONE</w:t>
+            </w:r>
+          </w:p>
+        </w:tc>
+        <w:tc>
+          <w:tcPr>
+            <w:tcW w:type="dxa" w:w="3120"/>
+            <w:tcBorders>
+              <w:top w:val="single" w:color="BBBBBB" w:sz="4"/>
+              <w:left w:val="single" w:color="BBBBBB" w:sz="4"/>
+              <w:bottom w:val="single" w:color="BBBBBB" w:sz="4"/>
+              <w:right w:val="single" w:color="BBBBBB" w:sz="4"/>
+            </w:tcBorders>
+            <w:tcMar>
+              <w:top w:type="dxa" w:w="80"/>
+              <w:left w:type="dxa" w:w="120"/>
+              <w:bottom w:type="dxa" w:w="80"/>
+              <w:right w:type="dxa" w:w="120"/>
+            </w:tcMar>
+          </w:tcPr>
+          <w:p>
+            <w:r>
+              <w:rPr>
+                <w:rFonts w:ascii="Arial" w:cs="Arial" w:eastAsia="Arial" w:hAnsi="Arial"/>
+                <w:b w:val="false"/>
+                <w:bCs w:val="false"/>
+                <w:sz w:val="20"/>
+                <w:szCs w:val="20"/>
+              </w:rPr>
+              <w:t xml:space="preserve">Model + 5 tests + colleague-facing notebook + PSSE phase1 benchmark.</w:t>
+            </w:r>
+          </w:p>
+        </w:tc>
+      </w:tr>
+      <w:tr>
+        <w:tc>
+          <w:tcPr>
+            <w:tcW w:type="dxa" w:w="3120"/>
+            <w:tcBorders>
+              <w:top w:val="single" w:color="BBBBBB" w:sz="4"/>
+              <w:left w:val="single" w:color="BBBBBB" w:sz="4"/>
+              <w:bottom w:val="single" w:color="BBBBBB" w:sz="4"/>
+              <w:right w:val="single" w:color="BBBBBB" w:sz="4"/>
+            </w:tcBorders>
+            <w:tcMar>
+              <w:top w:type="dxa" w:w="80"/>
+              <w:left w:type="dxa" w:w="120"/>
+              <w:bottom w:type="dxa" w:w="80"/>
+              <w:right w:type="dxa" w:w="120"/>
+            </w:tcMar>
+          </w:tcPr>
+          <w:p>
+            <w:r>
+              <w:rPr>
+                <w:rFonts w:ascii="Arial" w:cs="Arial" w:eastAsia="Arial" w:hAnsi="Arial"/>
+                <w:b w:val="false"/>
+                <w:bCs w:val="false"/>
+                <w:sz w:val="20"/>
+                <w:szCs w:val="20"/>
+              </w:rPr>
+              <w:t xml:space="preserve">2.0. GENROU bare</w:t>
+            </w:r>
+          </w:p>
+        </w:tc>
+        <w:tc>
+          <w:tcPr>
+            <w:tcW w:type="dxa" w:w="3120"/>
+            <w:tcBorders>
+              <w:top w:val="single" w:color="BBBBBB" w:sz="4"/>
+              <w:left w:val="single" w:color="BBBBBB" w:sz="4"/>
+              <w:bottom w:val="single" w:color="BBBBBB" w:sz="4"/>
+              <w:right w:val="single" w:color="BBBBBB" w:sz="4"/>
+            </w:tcBorders>
+            <w:tcMar>
+              <w:top w:type="dxa" w:w="80"/>
+              <w:left w:type="dxa" w:w="120"/>
+              <w:bottom w:type="dxa" w:w="80"/>
+              <w:right w:type="dxa" w:w="120"/>
+            </w:tcMar>
+          </w:tcPr>
+          <w:p>
+            <w:r>
+              <w:rPr>
+                <w:rFonts w:ascii="Arial" w:cs="Arial" w:eastAsia="Arial" w:hAnsi="Arial"/>
+                <w:b w:val="false"/>
+                <w:bCs w:val="false"/>
+                <w:sz w:val="20"/>
+                <w:szCs w:val="20"/>
+              </w:rPr>
+              <w:t xml:space="preserve">IN FLIGHT</w:t>
+            </w:r>
+          </w:p>
+        </w:tc>
+        <w:tc>
+          <w:tcPr>
+            <w:tcW w:type="dxa" w:w="3120"/>
+            <w:tcBorders>
+              <w:top w:val="single" w:color="BBBBBB" w:sz="4"/>
+              <w:left w:val="single" w:color="BBBBBB" w:sz="4"/>
+              <w:bottom w:val="single" w:color="BBBBBB" w:sz="4"/>
+              <w:right w:val="single" w:color="BBBBBB" w:sz="4"/>
+            </w:tcBorders>
+            <w:tcMar>
+              <w:top w:type="dxa" w:w="80"/>
+              <w:left w:type="dxa" w:w="120"/>
+              <w:bottom w:type="dxa" w:w="80"/>
+              <w:right w:type="dxa" w:w="120"/>
+            </w:tcMar>
+          </w:tcPr>
+          <w:p>
+            <w:r>
+              <w:rPr>
+                <w:rFonts w:ascii="Arial" w:cs="Arial" w:eastAsia="Arial" w:hAnsi="Arial"/>
+                <w:b w:val="false"/>
+                <w:bCs w:val="false"/>
+                <w:sz w:val="20"/>
+                <w:szCs w:val="20"/>
+              </w:rPr>
+              <w:t xml:space="preserve">Model done; foundations doc + d-axis equiv-circuit SVGs done; sign convention fixed across gencls.py and genrou.py. Pending: simulator helper with 2x2 saliency-aware solve, 5-test battery, Phase 2.0 notebook, PSSE phase2_0 benchmark.</w:t>
+            </w:r>
+          </w:p>
+        </w:tc>
+      </w:tr>
+      <w:tr>
+        <w:tc>
+          <w:tcPr>
+            <w:tcW w:type="dxa" w:w="3120"/>
+            <w:tcBorders>
+              <w:top w:val="single" w:color="BBBBBB" w:sz="4"/>
+              <w:left w:val="single" w:color="BBBBBB" w:sz="4"/>
+              <w:bottom w:val="single" w:color="BBBBBB" w:sz="4"/>
+              <w:right w:val="single" w:color="BBBBBB" w:sz="4"/>
+            </w:tcBorders>
+            <w:tcMar>
+              <w:top w:type="dxa" w:w="80"/>
+              <w:left w:type="dxa" w:w="120"/>
+              <w:bottom w:type="dxa" w:w="80"/>
+              <w:right w:type="dxa" w:w="120"/>
+            </w:tcMar>
+          </w:tcPr>
+          <w:p>
+            <w:r>
+              <w:rPr>
+                <w:rFonts w:ascii="Arial" w:cs="Arial" w:eastAsia="Arial" w:hAnsi="Arial"/>
+                <w:b w:val="false"/>
+                <w:bCs w:val="false"/>
+                <w:sz w:val="20"/>
+                <w:szCs w:val="20"/>
+              </w:rPr>
+              <w:t xml:space="preserve">2.1. + ST1A AVR</w:t>
+            </w:r>
+          </w:p>
+        </w:tc>
+        <w:tc>
+          <w:tcPr>
+            <w:tcW w:type="dxa" w:w="3120"/>
+            <w:tcBorders>
+              <w:top w:val="single" w:color="BBBBBB" w:sz="4"/>
+              <w:left w:val="single" w:color="BBBBBB" w:sz="4"/>
+              <w:bottom w:val="single" w:color="BBBBBB" w:sz="4"/>
+              <w:right w:val="single" w:color="BBBBBB" w:sz="4"/>
+            </w:tcBorders>
+            <w:tcMar>
+              <w:top w:type="dxa" w:w="80"/>
+              <w:left w:type="dxa" w:w="120"/>
+              <w:bottom w:type="dxa" w:w="80"/>
+              <w:right w:type="dxa" w:w="120"/>
+            </w:tcMar>
+          </w:tcPr>
+          <w:p>
+            <w:r>
+              <w:rPr>
+                <w:rFonts w:ascii="Arial" w:cs="Arial" w:eastAsia="Arial" w:hAnsi="Arial"/>
+                <w:b w:val="false"/>
+                <w:bCs w:val="false"/>
+                <w:sz w:val="20"/>
+                <w:szCs w:val="20"/>
+              </w:rPr>
+              <w:t xml:space="preserve">PENDING</w:t>
+            </w:r>
+          </w:p>
+        </w:tc>
+        <w:tc>
+          <w:tcPr>
+            <w:tcW w:type="dxa" w:w="3120"/>
+            <w:tcBorders>
+              <w:top w:val="single" w:color="BBBBBB" w:sz="4"/>
+              <w:left w:val="single" w:color="BBBBBB" w:sz="4"/>
+              <w:bottom w:val="single" w:color="BBBBBB" w:sz="4"/>
+              <w:right w:val="single" w:color="BBBBBB" w:sz="4"/>
+            </w:tcBorders>
+            <w:tcMar>
+              <w:top w:type="dxa" w:w="80"/>
+              <w:left w:type="dxa" w:w="120"/>
+              <w:bottom w:type="dxa" w:w="80"/>
+              <w:right w:type="dxa" w:w="120"/>
+            </w:tcMar>
+          </w:tcPr>
+          <w:p>
+            <w:r>
+              <w:rPr>
+                <w:rFonts w:ascii="Arial" w:cs="Arial" w:eastAsia="Arial" w:hAnsi="Arial"/>
+                <w:b w:val="false"/>
+                <w:bCs w:val="false"/>
+                <w:sz w:val="20"/>
+                <w:szCs w:val="20"/>
+              </w:rPr>
+              <w:t xml:space="preserve">Static exciter with high-gain PI loop; demonstrates LV reactive support boost.</w:t>
+            </w:r>
+          </w:p>
+        </w:tc>
+      </w:tr>
+      <w:tr>
+        <w:tc>
+          <w:tcPr>
+            <w:tcW w:type="dxa" w:w="3120"/>
+            <w:tcBorders>
+              <w:top w:val="single" w:color="BBBBBB" w:sz="4"/>
+              <w:left w:val="single" w:color="BBBBBB" w:sz="4"/>
+              <w:bottom w:val="single" w:color="BBBBBB" w:sz="4"/>
+              <w:right w:val="single" w:color="BBBBBB" w:sz="4"/>
+            </w:tcBorders>
+            <w:tcMar>
+              <w:top w:type="dxa" w:w="80"/>
+              <w:left w:type="dxa" w:w="120"/>
+              <w:bottom w:type="dxa" w:w="80"/>
+              <w:right w:type="dxa" w:w="120"/>
+            </w:tcMar>
+          </w:tcPr>
+          <w:p>
+            <w:r>
+              <w:rPr>
+                <w:rFonts w:ascii="Arial" w:cs="Arial" w:eastAsia="Arial" w:hAnsi="Arial"/>
+                <w:b w:val="false"/>
+                <w:bCs w:val="false"/>
+                <w:sz w:val="20"/>
+                <w:szCs w:val="20"/>
+              </w:rPr>
+              <w:t xml:space="preserve">2.2. + PSS1A</w:t>
+            </w:r>
+          </w:p>
+        </w:tc>
+        <w:tc>
+          <w:tcPr>
+            <w:tcW w:type="dxa" w:w="3120"/>
+            <w:tcBorders>
+              <w:top w:val="single" w:color="BBBBBB" w:sz="4"/>
+              <w:left w:val="single" w:color="BBBBBB" w:sz="4"/>
+              <w:bottom w:val="single" w:color="BBBBBB" w:sz="4"/>
+              <w:right w:val="single" w:color="BBBBBB" w:sz="4"/>
+            </w:tcBorders>
+            <w:tcMar>
+              <w:top w:type="dxa" w:w="80"/>
+              <w:left w:type="dxa" w:w="120"/>
+              <w:bottom w:type="dxa" w:w="80"/>
+              <w:right w:type="dxa" w:w="120"/>
+            </w:tcMar>
+          </w:tcPr>
+          <w:p>
+            <w:r>
+              <w:rPr>
+                <w:rFonts w:ascii="Arial" w:cs="Arial" w:eastAsia="Arial" w:hAnsi="Arial"/>
+                <w:b w:val="false"/>
+                <w:bCs w:val="false"/>
+                <w:sz w:val="20"/>
+                <w:szCs w:val="20"/>
+              </w:rPr>
+              <w:t xml:space="preserve">PENDING</w:t>
+            </w:r>
+          </w:p>
+        </w:tc>
+        <w:tc>
+          <w:tcPr>
+            <w:tcW w:type="dxa" w:w="3120"/>
+            <w:tcBorders>
+              <w:top w:val="single" w:color="BBBBBB" w:sz="4"/>
+              <w:left w:val="single" w:color="BBBBBB" w:sz="4"/>
+              <w:bottom w:val="single" w:color="BBBBBB" w:sz="4"/>
+              <w:right w:val="single" w:color="BBBBBB" w:sz="4"/>
+            </w:tcBorders>
+            <w:tcMar>
+              <w:top w:type="dxa" w:w="80"/>
+              <w:left w:type="dxa" w:w="120"/>
+              <w:bottom w:type="dxa" w:w="80"/>
+              <w:right w:type="dxa" w:w="120"/>
+            </w:tcMar>
+          </w:tcPr>
+          <w:p>
+            <w:r>
+              <w:rPr>
+                <w:rFonts w:ascii="Arial" w:cs="Arial" w:eastAsia="Arial" w:hAnsi="Arial"/>
+                <w:b w:val="false"/>
+                <w:bCs w:val="false"/>
+                <w:sz w:val="20"/>
+                <w:szCs w:val="20"/>
+              </w:rPr>
+              <w:t xml:space="preserve">Single-input stabiliser; headline plot is "with vs without PSS" on a fault.</w:t>
+            </w:r>
+          </w:p>
+        </w:tc>
+      </w:tr>
+      <w:tr>
+        <w:tc>
+          <w:tcPr>
+            <w:tcW w:type="dxa" w:w="3120"/>
+            <w:tcBorders>
+              <w:top w:val="single" w:color="BBBBBB" w:sz="4"/>
+              <w:left w:val="single" w:color="BBBBBB" w:sz="4"/>
+              <w:bottom w:val="single" w:color="BBBBBB" w:sz="4"/>
+              <w:right w:val="single" w:color="BBBBBB" w:sz="4"/>
+            </w:tcBorders>
+            <w:tcMar>
+              <w:top w:type="dxa" w:w="80"/>
+              <w:left w:type="dxa" w:w="120"/>
+              <w:bottom w:type="dxa" w:w="80"/>
+              <w:right w:type="dxa" w:w="120"/>
+            </w:tcMar>
+          </w:tcPr>
+          <w:p>
+            <w:r>
+              <w:rPr>
+                <w:rFonts w:ascii="Arial" w:cs="Arial" w:eastAsia="Arial" w:hAnsi="Arial"/>
+                <w:b w:val="false"/>
+                <w:bCs w:val="false"/>
+                <w:sz w:val="20"/>
+                <w:szCs w:val="20"/>
+              </w:rPr>
+              <w:t xml:space="preserve">2.3. + TGOV1</w:t>
+            </w:r>
+          </w:p>
+        </w:tc>
+        <w:tc>
+          <w:tcPr>
+            <w:tcW w:type="dxa" w:w="3120"/>
+            <w:tcBorders>
+              <w:top w:val="single" w:color="BBBBBB" w:sz="4"/>
+              <w:left w:val="single" w:color="BBBBBB" w:sz="4"/>
+              <w:bottom w:val="single" w:color="BBBBBB" w:sz="4"/>
+              <w:right w:val="single" w:color="BBBBBB" w:sz="4"/>
+            </w:tcBorders>
+            <w:tcMar>
+              <w:top w:type="dxa" w:w="80"/>
+              <w:left w:type="dxa" w:w="120"/>
+              <w:bottom w:type="dxa" w:w="80"/>
+              <w:right w:type="dxa" w:w="120"/>
+            </w:tcMar>
+          </w:tcPr>
+          <w:p>
+            <w:r>
+              <w:rPr>
+                <w:rFonts w:ascii="Arial" w:cs="Arial" w:eastAsia="Arial" w:hAnsi="Arial"/>
+                <w:b w:val="false"/>
+                <w:bCs w:val="false"/>
+                <w:sz w:val="20"/>
+                <w:szCs w:val="20"/>
+              </w:rPr>
+              <w:t xml:space="preserve">PENDING</w:t>
+            </w:r>
+          </w:p>
+        </w:tc>
+        <w:tc>
+          <w:tcPr>
+            <w:tcW w:type="dxa" w:w="3120"/>
+            <w:tcBorders>
+              <w:top w:val="single" w:color="BBBBBB" w:sz="4"/>
+              <w:left w:val="single" w:color="BBBBBB" w:sz="4"/>
+              <w:bottom w:val="single" w:color="BBBBBB" w:sz="4"/>
+              <w:right w:val="single" w:color="BBBBBB" w:sz="4"/>
+            </w:tcBorders>
+            <w:tcMar>
+              <w:top w:type="dxa" w:w="80"/>
+              <w:left w:type="dxa" w:w="120"/>
+              <w:bottom w:type="dxa" w:w="80"/>
+              <w:right w:type="dxa" w:w="120"/>
+            </w:tcMar>
+          </w:tcPr>
+          <w:p>
+            <w:r>
+              <w:rPr>
+                <w:rFonts w:ascii="Arial" w:cs="Arial" w:eastAsia="Arial" w:hAnsi="Arial"/>
+                <w:b w:val="false"/>
+                <w:bCs w:val="false"/>
+                <w:sz w:val="20"/>
+                <w:szCs w:val="20"/>
+              </w:rPr>
+              <w:t xml:space="preserve">Steam governor with droop; primary frequency response on a load step.</w:t>
+            </w:r>
+          </w:p>
+        </w:tc>
+      </w:tr>
+      <w:tr>
+        <w:tc>
+          <w:tcPr>
+            <w:tcW w:type="dxa" w:w="3120"/>
+            <w:tcBorders>
+              <w:top w:val="single" w:color="BBBBBB" w:sz="4"/>
+              <w:left w:val="single" w:color="BBBBBB" w:sz="4"/>
+              <w:bottom w:val="single" w:color="BBBBBB" w:sz="4"/>
+              <w:right w:val="single" w:color="BBBBBB" w:sz="4"/>
+            </w:tcBorders>
+            <w:tcMar>
+              <w:top w:type="dxa" w:w="80"/>
+              <w:left w:type="dxa" w:w="120"/>
+              <w:bottom w:type="dxa" w:w="80"/>
+              <w:right w:type="dxa" w:w="120"/>
+            </w:tcMar>
+          </w:tcPr>
+          <w:p>
+            <w:r>
+              <w:rPr>
+                <w:rFonts w:ascii="Arial" w:cs="Arial" w:eastAsia="Arial" w:hAnsi="Arial"/>
+                <w:b w:val="false"/>
+                <w:bCs w:val="false"/>
+                <w:sz w:val="20"/>
+                <w:szCs w:val="20"/>
+              </w:rPr>
+              <w:t xml:space="preserve">3. IBR generic (REGC + REEC + REPC)</w:t>
+            </w:r>
+          </w:p>
+        </w:tc>
+        <w:tc>
+          <w:tcPr>
+            <w:tcW w:type="dxa" w:w="3120"/>
+            <w:tcBorders>
+              <w:top w:val="single" w:color="BBBBBB" w:sz="4"/>
+              <w:left w:val="single" w:color="BBBBBB" w:sz="4"/>
+              <w:bottom w:val="single" w:color="BBBBBB" w:sz="4"/>
+              <w:right w:val="single" w:color="BBBBBB" w:sz="4"/>
+            </w:tcBorders>
+            <w:tcMar>
+              <w:top w:type="dxa" w:w="80"/>
+              <w:left w:type="dxa" w:w="120"/>
+              <w:bottom w:type="dxa" w:w="80"/>
+              <w:right w:type="dxa" w:w="120"/>
+            </w:tcMar>
+          </w:tcPr>
+          <w:p>
+            <w:r>
+              <w:rPr>
+                <w:rFonts w:ascii="Arial" w:cs="Arial" w:eastAsia="Arial" w:hAnsi="Arial"/>
+                <w:b w:val="false"/>
+                <w:bCs w:val="false"/>
+                <w:sz w:val="20"/>
+                <w:szCs w:val="20"/>
+              </w:rPr>
+              <w:t xml:space="preserve">PENDING</w:t>
+            </w:r>
+          </w:p>
+        </w:tc>
+        <w:tc>
+          <w:tcPr>
+            <w:tcW w:type="dxa" w:w="3120"/>
+            <w:tcBorders>
+              <w:top w:val="single" w:color="BBBBBB" w:sz="4"/>
+              <w:left w:val="single" w:color="BBBBBB" w:sz="4"/>
+              <w:bottom w:val="single" w:color="BBBBBB" w:sz="4"/>
+              <w:right w:val="single" w:color="BBBBBB" w:sz="4"/>
+            </w:tcBorders>
+            <w:tcMar>
+              <w:top w:type="dxa" w:w="80"/>
+              <w:left w:type="dxa" w:w="120"/>
+              <w:bottom w:type="dxa" w:w="80"/>
+              <w:right w:type="dxa" w:w="120"/>
+            </w:tcMar>
+          </w:tcPr>
+          <w:p>
+            <w:r>
+              <w:rPr>
+                <w:rFonts w:ascii="Arial" w:cs="Arial" w:eastAsia="Arial" w:hAnsi="Arial"/>
+                <w:b w:val="false"/>
+                <w:bCs w:val="false"/>
+                <w:sz w:val="20"/>
+                <w:szCs w:val="20"/>
+              </w:rPr>
+              <w:t xml:space="preserve">PLL anchored on MHI PSCAD doc; weak-grid SCR sweep.</w:t>
+            </w:r>
+          </w:p>
+        </w:tc>
+      </w:tr>
+      <w:tr>
+        <w:tc>
+          <w:tcPr>
+            <w:tcW w:type="dxa" w:w="3120"/>
+            <w:tcBorders>
+              <w:top w:val="single" w:color="BBBBBB" w:sz="4"/>
+              <w:left w:val="single" w:color="BBBBBB" w:sz="4"/>
+              <w:bottom w:val="single" w:color="BBBBBB" w:sz="4"/>
+              <w:right w:val="single" w:color="BBBBBB" w:sz="4"/>
+            </w:tcBorders>
+            <w:tcMar>
+              <w:top w:type="dxa" w:w="80"/>
+              <w:left w:type="dxa" w:w="120"/>
+              <w:bottom w:type="dxa" w:w="80"/>
+              <w:right w:type="dxa" w:w="120"/>
+            </w:tcMar>
+          </w:tcPr>
+          <w:p>
+            <w:r>
+              <w:rPr>
+                <w:rFonts w:ascii="Arial" w:cs="Arial" w:eastAsia="Arial" w:hAnsi="Arial"/>
+                <w:b w:val="false"/>
+                <w:bCs w:val="false"/>
+                <w:sz w:val="20"/>
+                <w:szCs w:val="20"/>
+              </w:rPr>
+              <w:t xml:space="preserve">4. IBR grid-forming (REGFM)</w:t>
+            </w:r>
+          </w:p>
+        </w:tc>
+        <w:tc>
+          <w:tcPr>
+            <w:tcW w:type="dxa" w:w="3120"/>
+            <w:tcBorders>
+              <w:top w:val="single" w:color="BBBBBB" w:sz="4"/>
+              <w:left w:val="single" w:color="BBBBBB" w:sz="4"/>
+              <w:bottom w:val="single" w:color="BBBBBB" w:sz="4"/>
+              <w:right w:val="single" w:color="BBBBBB" w:sz="4"/>
+            </w:tcBorders>
+            <w:tcMar>
+              <w:top w:type="dxa" w:w="80"/>
+              <w:left w:type="dxa" w:w="120"/>
+              <w:bottom w:type="dxa" w:w="80"/>
+              <w:right w:type="dxa" w:w="120"/>
+            </w:tcMar>
+          </w:tcPr>
+          <w:p>
+            <w:r>
+              <w:rPr>
+                <w:rFonts w:ascii="Arial" w:cs="Arial" w:eastAsia="Arial" w:hAnsi="Arial"/>
+                <w:b w:val="false"/>
+                <w:bCs w:val="false"/>
+                <w:sz w:val="20"/>
+                <w:szCs w:val="20"/>
+              </w:rPr>
+              <w:t xml:space="preserve">PENDING</w:t>
+            </w:r>
+          </w:p>
+        </w:tc>
+        <w:tc>
+          <w:tcPr>
+            <w:tcW w:type="dxa" w:w="3120"/>
+            <w:tcBorders>
+              <w:top w:val="single" w:color="BBBBBB" w:sz="4"/>
+              <w:left w:val="single" w:color="BBBBBB" w:sz="4"/>
+              <w:bottom w:val="single" w:color="BBBBBB" w:sz="4"/>
+              <w:right w:val="single" w:color="BBBBBB" w:sz="4"/>
+            </w:tcBorders>
+            <w:tcMar>
+              <w:top w:type="dxa" w:w="80"/>
+              <w:left w:type="dxa" w:w="120"/>
+              <w:bottom w:type="dxa" w:w="80"/>
+              <w:right w:type="dxa" w:w="120"/>
+            </w:tcMar>
+          </w:tcPr>
+          <w:p>
+            <w:r>
+              <w:rPr>
+                <w:rFonts w:ascii="Arial" w:cs="Arial" w:eastAsia="Arial" w:hAnsi="Arial"/>
+                <w:b w:val="false"/>
+                <w:bCs w:val="false"/>
+                <w:sz w:val="20"/>
+                <w:szCs w:val="20"/>
+              </w:rPr>
+              <w:t xml:space="preserve">Side-by-side with Phase 3 on the same fault battery.</w:t>
+            </w:r>
+          </w:p>
+        </w:tc>
+      </w:tr>
+      <w:tr>
+        <w:tc>
+          <w:tcPr>
+            <w:tcW w:type="dxa" w:w="3120"/>
+            <w:tcBorders>
+              <w:top w:val="single" w:color="BBBBBB" w:sz="4"/>
+              <w:left w:val="single" w:color="BBBBBB" w:sz="4"/>
+              <w:bottom w:val="single" w:color="BBBBBB" w:sz="4"/>
+              <w:right w:val="single" w:color="BBBBBB" w:sz="4"/>
+            </w:tcBorders>
+            <w:tcMar>
+              <w:top w:type="dxa" w:w="80"/>
+              <w:left w:type="dxa" w:w="120"/>
+              <w:bottom w:type="dxa" w:w="80"/>
+              <w:right w:type="dxa" w:w="120"/>
+            </w:tcMar>
+          </w:tcPr>
+          <w:p>
+            <w:r>
+              <w:rPr>
+                <w:rFonts w:ascii="Arial" w:cs="Arial" w:eastAsia="Arial" w:hAnsi="Arial"/>
+                <w:b w:val="false"/>
+                <w:bCs w:val="false"/>
+                <w:sz w:val="20"/>
+                <w:szCs w:val="20"/>
+              </w:rPr>
+              <w:t xml:space="preserve">5. Reactive support (SVSMO3, CSTATT, SynCon)</w:t>
+            </w:r>
+          </w:p>
+        </w:tc>
+        <w:tc>
+          <w:tcPr>
+            <w:tcW w:type="dxa" w:w="3120"/>
+            <w:tcBorders>
+              <w:top w:val="single" w:color="BBBBBB" w:sz="4"/>
+              <w:left w:val="single" w:color="BBBBBB" w:sz="4"/>
+              <w:bottom w:val="single" w:color="BBBBBB" w:sz="4"/>
+              <w:right w:val="single" w:color="BBBBBB" w:sz="4"/>
+            </w:tcBorders>
+            <w:tcMar>
+              <w:top w:type="dxa" w:w="80"/>
+              <w:left w:type="dxa" w:w="120"/>
+              <w:bottom w:type="dxa" w:w="80"/>
+              <w:right w:type="dxa" w:w="120"/>
+            </w:tcMar>
+          </w:tcPr>
+          <w:p>
+            <w:r>
+              <w:rPr>
+                <w:rFonts w:ascii="Arial" w:cs="Arial" w:eastAsia="Arial" w:hAnsi="Arial"/>
+                <w:b w:val="false"/>
+                <w:bCs w:val="false"/>
+                <w:sz w:val="20"/>
+                <w:szCs w:val="20"/>
+              </w:rPr>
+              <w:t xml:space="preserve">PENDING</w:t>
+            </w:r>
+          </w:p>
+        </w:tc>
+        <w:tc>
+          <w:tcPr>
+            <w:tcW w:type="dxa" w:w="3120"/>
+            <w:tcBorders>
+              <w:top w:val="single" w:color="BBBBBB" w:sz="4"/>
+              <w:left w:val="single" w:color="BBBBBB" w:sz="4"/>
+              <w:bottom w:val="single" w:color="BBBBBB" w:sz="4"/>
+              <w:right w:val="single" w:color="BBBBBB" w:sz="4"/>
+            </w:tcBorders>
+            <w:tcMar>
+              <w:top w:type="dxa" w:w="80"/>
+              <w:left w:type="dxa" w:w="120"/>
+              <w:bottom w:type="dxa" w:w="80"/>
+              <w:right w:type="dxa" w:w="120"/>
+            </w:tcMar>
+          </w:tcPr>
+          <w:p>
+            <w:r>
+              <w:rPr>
+                <w:rFonts w:ascii="Arial" w:cs="Arial" w:eastAsia="Arial" w:hAnsi="Arial"/>
+                <w:b w:val="false"/>
+                <w:bCs w:val="false"/>
+                <w:sz w:val="20"/>
+                <w:szCs w:val="20"/>
+              </w:rPr>
+              <w:t xml:space="preserve">Q=V*B trap of SVC, linear-current STATCOM, OEL/UEL on SynCon.</w:t>
+            </w:r>
+          </w:p>
+        </w:tc>
+      </w:tr>
+      <w:tr>
+        <w:tc>
+          <w:tcPr>
+            <w:tcW w:type="dxa" w:w="3120"/>
+            <w:tcBorders>
+              <w:top w:val="single" w:color="BBBBBB" w:sz="4"/>
+              <w:left w:val="single" w:color="BBBBBB" w:sz="4"/>
+              <w:bottom w:val="single" w:color="BBBBBB" w:sz="4"/>
+              <w:right w:val="single" w:color="BBBBBB" w:sz="4"/>
+            </w:tcBorders>
+            <w:tcMar>
+              <w:top w:type="dxa" w:w="80"/>
+              <w:left w:type="dxa" w:w="120"/>
+              <w:bottom w:type="dxa" w:w="80"/>
+              <w:right w:type="dxa" w:w="120"/>
+            </w:tcMar>
+          </w:tcPr>
+          <w:p>
+            <w:r>
+              <w:rPr>
+                <w:rFonts w:ascii="Arial" w:cs="Arial" w:eastAsia="Arial" w:hAnsi="Arial"/>
+                <w:b w:val="false"/>
+                <w:bCs w:val="false"/>
+                <w:sz w:val="20"/>
+                <w:szCs w:val="20"/>
+              </w:rPr>
+              <w:t xml:space="preserve">6. Scenario browser</w:t>
+            </w:r>
+          </w:p>
+        </w:tc>
+        <w:tc>
+          <w:tcPr>
+            <w:tcW w:type="dxa" w:w="3120"/>
+            <w:tcBorders>
+              <w:top w:val="single" w:color="BBBBBB" w:sz="4"/>
+              <w:left w:val="single" w:color="BBBBBB" w:sz="4"/>
+              <w:bottom w:val="single" w:color="BBBBBB" w:sz="4"/>
+              <w:right w:val="single" w:color="BBBBBB" w:sz="4"/>
+            </w:tcBorders>
+            <w:tcMar>
+              <w:top w:type="dxa" w:w="80"/>
+              <w:left w:type="dxa" w:w="120"/>
+              <w:bottom w:type="dxa" w:w="80"/>
+              <w:right w:type="dxa" w:w="120"/>
+            </w:tcMar>
+          </w:tcPr>
+          <w:p>
+            <w:r>
+              <w:rPr>
+                <w:rFonts w:ascii="Arial" w:cs="Arial" w:eastAsia="Arial" w:hAnsi="Arial"/>
+                <w:b w:val="false"/>
+                <w:bCs w:val="false"/>
+                <w:sz w:val="20"/>
+                <w:szCs w:val="20"/>
+              </w:rPr>
+              <w:t xml:space="preserve">PENDING</w:t>
+            </w:r>
+          </w:p>
+        </w:tc>
+        <w:tc>
+          <w:tcPr>
+            <w:tcW w:type="dxa" w:w="3120"/>
+            <w:tcBorders>
+              <w:top w:val="single" w:color="BBBBBB" w:sz="4"/>
+              <w:left w:val="single" w:color="BBBBBB" w:sz="4"/>
+              <w:bottom w:val="single" w:color="BBBBBB" w:sz="4"/>
+              <w:right w:val="single" w:color="BBBBBB" w:sz="4"/>
+            </w:tcBorders>
+            <w:tcMar>
+              <w:top w:type="dxa" w:w="80"/>
+              <w:left w:type="dxa" w:w="120"/>
+              <w:bottom w:type="dxa" w:w="80"/>
+              <w:right w:type="dxa" w:w="120"/>
+            </w:tcMar>
+          </w:tcPr>
+          <w:p>
+            <w:r>
+              <w:rPr>
+                <w:rFonts w:ascii="Arial" w:cs="Arial" w:eastAsia="Arial" w:hAnsi="Arial"/>
+                <w:b w:val="false"/>
+                <w:bCs w:val="false"/>
+                <w:sz w:val="20"/>
+                <w:szCs w:val="20"/>
+              </w:rPr>
+              <w:t xml:space="preserve">Dedicated ipywidgets explorer over the full library.</w:t>
+            </w:r>
+          </w:p>
+        </w:tc>
+      </w:tr>
+      <w:tr>
+        <w:tc>
+          <w:tcPr>
+            <w:tcW w:type="dxa" w:w="3120"/>
+            <w:tcBorders>
+              <w:top w:val="single" w:color="BBBBBB" w:sz="4"/>
+              <w:left w:val="single" w:color="BBBBBB" w:sz="4"/>
+              <w:bottom w:val="single" w:color="BBBBBB" w:sz="4"/>
+              <w:right w:val="single" w:color="BBBBBB" w:sz="4"/>
+            </w:tcBorders>
+            <w:tcMar>
+              <w:top w:type="dxa" w:w="80"/>
+              <w:left w:type="dxa" w:w="120"/>
+              <w:bottom w:type="dxa" w:w="80"/>
+              <w:right w:type="dxa" w:w="120"/>
+            </w:tcMar>
+          </w:tcPr>
+          <w:p>
+            <w:r>
+              <w:rPr>
+                <w:rFonts w:ascii="Arial" w:cs="Arial" w:eastAsia="Arial" w:hAnsi="Arial"/>
+                <w:b w:val="false"/>
+                <w:bCs w:val="false"/>
+                <w:sz w:val="20"/>
+                <w:szCs w:val="20"/>
+              </w:rPr>
+              <w:t xml:space="preserve">7. Small-signal</w:t>
+            </w:r>
+          </w:p>
+        </w:tc>
+        <w:tc>
+          <w:tcPr>
+            <w:tcW w:type="dxa" w:w="3120"/>
+            <w:tcBorders>
+              <w:top w:val="single" w:color="BBBBBB" w:sz="4"/>
+              <w:left w:val="single" w:color="BBBBBB" w:sz="4"/>
+              <w:bottom w:val="single" w:color="BBBBBB" w:sz="4"/>
+              <w:right w:val="single" w:color="BBBBBB" w:sz="4"/>
+            </w:tcBorders>
+            <w:tcMar>
+              <w:top w:type="dxa" w:w="80"/>
+              <w:left w:type="dxa" w:w="120"/>
+              <w:bottom w:type="dxa" w:w="80"/>
+              <w:right w:type="dxa" w:w="120"/>
+            </w:tcMar>
+          </w:tcPr>
+          <w:p>
+            <w:r>
+              <w:rPr>
+                <w:rFonts w:ascii="Arial" w:cs="Arial" w:eastAsia="Arial" w:hAnsi="Arial"/>
+                <w:b w:val="false"/>
+                <w:bCs w:val="false"/>
+                <w:sz w:val="20"/>
+                <w:szCs w:val="20"/>
+              </w:rPr>
+              <w:t xml:space="preserve">PENDING</w:t>
+            </w:r>
+          </w:p>
+        </w:tc>
+        <w:tc>
+          <w:tcPr>
+            <w:tcW w:type="dxa" w:w="3120"/>
+            <w:tcBorders>
+              <w:top w:val="single" w:color="BBBBBB" w:sz="4"/>
+              <w:left w:val="single" w:color="BBBBBB" w:sz="4"/>
+              <w:bottom w:val="single" w:color="BBBBBB" w:sz="4"/>
+              <w:right w:val="single" w:color="BBBBBB" w:sz="4"/>
+            </w:tcBorders>
+            <w:tcMar>
+              <w:top w:type="dxa" w:w="80"/>
+              <w:left w:type="dxa" w:w="120"/>
+              <w:bottom w:type="dxa" w:w="80"/>
+              <w:right w:type="dxa" w:w="120"/>
+            </w:tcMar>
+          </w:tcPr>
+          <w:p>
+            <w:r>
+              <w:rPr>
+                <w:rFonts w:ascii="Arial" w:cs="Arial" w:eastAsia="Arial" w:hAnsi="Arial"/>
+                <w:b w:val="false"/>
+                <w:bCs w:val="false"/>
+                <w:sz w:val="20"/>
+                <w:szCs w:val="20"/>
+              </w:rPr>
+              <w:t xml:space="preserve">Numerical eigenvalues + Prony, run last by design.</w:t>
+            </w:r>
+          </w:p>
+        </w:tc>
+      </w:tr>
+    </w:tbl>
+    <w:p>
+      <w:pPr>
+        <w:spacing w:after="120"/>
+      </w:pPr>
+      <w:r>
+        <w:rPr>
+          <w:rFonts w:ascii="Arial" w:cs="Arial" w:eastAsia="Arial" w:hAnsi="Arial"/>
+          <w:b w:val="false"/>
+          <w:bCs w:val="false"/>
+          <w:i w:val="false"/>
+          <w:iCs w:val="false"/>
+          <w:sz w:val="22"/>
+          <w:szCs w:val="22"/>
+        </w:rPr>
+        <w:t xml:space="preserve">Phase 2.0 inner status: smib/models/genrou.py implements the 4-state two-axis transient model (delta, omega, E'q, E'd) — sub-transient is deferred to a Phase 2.0b upgrade once the AVR/PSS/Governor stack is wired and we can validate first-cycle fault current against PSSE.  Init passes self-consistency at machine epsilon; flat-line drift over 5 s is &lt; 4e-14 deg.  The accompanying physical foundations doc covers every parameter (Xd / X'd / X"d hierarchy, T'd0 / T"d0 as L/R of rotor windings, leakage Xl, saturation A and B coefficients, Kundur Table 4.2 values).  The gencls.py dq sign convention was migrated to standard PSSE/Kundur during this phase (q-axis on real, d-axis 90 deg behind) so GENCLS and GENROU now speak the same language; all 8 Phase 1 tests still pass after the migration.  One follow-up flagged: the Phase 1 notebook narrative in section 8.1 still uses the old "Iq surges" wording — physics unchanged, label only — and will be refreshed before the next Phase 1 polish pass.</w:t>
+      </w:r>
+    </w:p>
     <w:p>
       <w:r>
         <w:br w:type="page"/>
@@ -5825,7 +6964,7 @@
           <w:sz w:val="22"/>
           <w:szCs w:val="22"/>
         </w:rPr>
-        <w:t xml:space="preserve">Phase 1 (GENCLS) is complete. The model lives in smib/models/gencls.py, the simulator harness in smib/simulator.py, the test battery in tests/test_gencls.py (5/5 passing), and the colleague-facing notebook in notebooks/phase1_gencls.ipynb. CCT brackets to 191 ms on the canonical operating point. Flat-line drift is exactly zero over 10 s. The notebook reads top-to-bottom as a teaching script ending in an interactive H × fault-duration sweep.</w:t>
+        <w:t xml:space="preserve">Phase 1 (GENCLS) is shipped: model, 5 tests, colleague-facing notebook with the seven pedagogy rules baked in, and a PSSE benchmark folder. CCT brackets to 191 ms on the canonical operating point; analytic EAC matches within 2.3 %. Flat-line drift is exactly zero over 10 s.</w:t>
       </w:r>
     </w:p>
     <w:p>
@@ -5842,7 +6981,41 @@
           <w:sz w:val="22"/>
           <w:szCs w:val="22"/>
         </w:rPr>
-        <w:t xml:space="preserve">Next up is Phase 2: GENROU + ST1A + PSS1A + TGOV1. This is the severe pain point — budget one to two weeks and expect most of that time to be initialisation debugging, not model implementation. The first concrete deliverable is GENROU alone (six electrical states + the two mechanical states already in GENCLS), with the same five tests reused (flat-line, analytic eigenvalue, CCT bracket, plus a flux-time-scale plot to teach constant-flux-linkage). Then layer ST1A, then PSS1A, then TGOV1, in that order, re-running the full battery between each addition.</w:t>
+        <w:t xml:space="preserve">Phase 2 has been broken into four atomic sub-increments — 2.0 GENROU bare, 2.1 +ST1A AVR, 2.2 +PSS1A stabiliser, 2.3 +TGOV1 governor — each landing as its own notebook on top of the previous one's code. Phase 2.0 is in flight: the GENROU model in smib/models/genrou.py is implemented as the simpler 4-state two-axis transient form (delta, omega, E'q, E'd, no sub-transient yet), the physical foundations document docs/genrou_physical_foundations.md is shipped with two SVG equivalent-circuit diagrams, and the gencls.py dq sign convention has been migrated to standard PSSE/Kundur. Init self-consistency passes at machine epsilon, flat-line drift over 5 s is &lt; 4e-14 deg, and all 8 Phase 1 tests still pass after the gencls.py migration.</w:t>
+      </w:r>
+    </w:p>
+    <w:p>
+      <w:pPr>
+        <w:spacing w:after="120"/>
+      </w:pPr>
+      <w:r>
+        <w:rPr>
+          <w:rFonts w:ascii="Arial" w:cs="Arial" w:eastAsia="Arial" w:hAnsi="Arial"/>
+          <w:b w:val="false"/>
+          <w:bCs w:val="false"/>
+          <w:i w:val="false"/>
+          <w:iCs w:val="false"/>
+          <w:sz w:val="22"/>
+          <w:szCs w:val="22"/>
+        </w:rPr>
+        <w:t xml:space="preserve">What lands next on Phase 2.0: a run_smib_genrou simulator helper with the 2x2 saliency-aware algebraic network solve (the simple Norton scalar in run_smib_gencls won't cut it because X'd != X'q now), a 5-test battery in tests/test_genrou.py (flat-line, GENCLS-equivalence limit when X_d=X'_d, analytic eigenvalue, CCT bracket, flux time-scale separation visible on a fault trace), notebooks/phase2_0_genrou.ipynb following the seven pedagogy rules, and a psse/phase2_0/ benchmark folder. Estimated 2-3 focused turns to close out Phase 2.0; another 2-3 turns each for 2.1, 2.2, 2.3.</w:t>
+      </w:r>
+    </w:p>
+    <w:p>
+      <w:pPr>
+        <w:spacing w:after="120"/>
+      </w:pPr>
+      <w:r>
+        <w:rPr>
+          <w:rFonts w:ascii="Arial" w:cs="Arial" w:eastAsia="Arial" w:hAnsi="Arial"/>
+          <w:b w:val="false"/>
+          <w:bCs w:val="false"/>
+          <w:i w:val="false"/>
+          <w:iCs w:val="false"/>
+          <w:sz w:val="22"/>
+          <w:szCs w:val="22"/>
+        </w:rPr>
+        <w:t xml:space="preserve">Phase 2 timeline note: master plan originally budgeted 1-2 weeks for the full GENROU + AVR + PSS + Gov stack. With the staged approach (one model added at a time, full test battery between each) this is achievable. The hardest debug session by far is the GENROU initialisation — ours has already been validated to machine epsilon, so the worst is behind us.</w:t>
       </w:r>
     </w:p>
     <w:sectPr>

</xml_diff>

<commit_message>
Switch to 50 Hz throughout + refresh Phase 1 §10.2 with block diagram and pseudocode
Code, tests, PSSE benchmark scripts, notebooks, and docs all default to
50 Hz (Australian grid).  All 13 tests pass at the new operating point.

Phase 1 notebook §10.2 ("the partitioned scheme") is rewritten from a
wordy 4-step prose list into engineer-scannable form: a rendered SVG
block diagram of the per-timestep data flow, a pseudocode block walking
through the predictor/corrector loop, and four annotated bullets calling
out the partition, the corrector, the Norton trick, and the frame bridge.

Also brings in the new foundations doc + supporting figures
(network_machine_interface.md, dq_frames.svg, partitioned_solver.svg).

Co-Authored-By: Claude Opus 4.7 (1M context) <noreply@anthropic.com>
</commit_message>
<xml_diff>
--- a/SMIB_Master_Plan.docx
+++ b/SMIB_Master_Plan.docx
@@ -237,25 +237,43 @@
           <w:sz w:val="22"/>
           <w:szCs w:val="22"/>
         </w:rPr>
-        <w:t xml:space="preserve">Network coupling: partitioned scheme. ODE step then algebraic Ybus solve, alternated inside the corrector. Simultaneous Newton is a known upgrade path if convergence fails.</w:t>
-      </w:r>
-    </w:p>
-    <w:p>
-      <w:pPr>
-        <w:pStyle w:val="ListParagraph"/>
-        <w:numPr>
-          <w:ilvl w:val="0"/>
-          <w:numId w:val="2"/>
-        </w:numPr>
-        <w:spacing w:after="80"/>
-      </w:pPr>
-      <w:r>
-        <w:rPr>
-          <w:rFonts w:ascii="Arial" w:cs="Arial" w:eastAsia="Arial" w:hAnsi="Arial"/>
-          <w:sz w:val="22"/>
-          <w:szCs w:val="22"/>
-        </w:rPr>
-        <w:t xml:space="preserve">Reference frame: single global synchronous DQ. Each synchronous machine rotates DQ into its own dq via its rotor angle delta. Each IBR carries its own PLL angle. This is the single largest source of initialisation bugs in DIY simulators, so it has its own test.</w:t>
+        <w:t xml:space="preserve">Network coupling: partitioned scheme. Machine differential equations live in each rotor's rotating dq frame; the algebraic network V = Y·I lives in the stationary system synchronous DQ frame. A rotation operator X_machine = X_global · exp(-j·delta) bridges the two each timestep. For linear machine models the Norton-augmented Ybus closes the algebraic loop in one matrix solve per step (no inner iteration). Simultaneous Newton is the upgrade path for non-linear loops (IBR current limits, AVR ceiling on long faults) and lands when needed in Phase 3 or later.</w:t>
+      </w:r>
+    </w:p>
+    <w:p>
+      <w:pPr>
+        <w:pStyle w:val="ListParagraph"/>
+        <w:numPr>
+          <w:ilvl w:val="0"/>
+          <w:numId w:val="2"/>
+        </w:numPr>
+        <w:spacing w:after="80"/>
+      </w:pPr>
+      <w:r>
+        <w:rPr>
+          <w:rFonts w:ascii="Arial" w:cs="Arial" w:eastAsia="Arial" w:hAnsi="Arial"/>
+          <w:sz w:val="22"/>
+          <w:szCs w:val="22"/>
+        </w:rPr>
+        <w:t xml:space="preserve">Reference frame: single global synchronous DQ for the network, one rotating dq frame per synchronous machine, one PLL frame per IBR. The rotation between frames is the single largest source of initialisation bugs in DIY simulators, so it has its own foundations document (docs/network_machine_interface.md) and test.</w:t>
+      </w:r>
+    </w:p>
+    <w:p>
+      <w:pPr>
+        <w:pStyle w:val="ListParagraph"/>
+        <w:numPr>
+          <w:ilvl w:val="0"/>
+          <w:numId w:val="2"/>
+        </w:numPr>
+        <w:spacing w:after="80"/>
+      </w:pPr>
+      <w:r>
+        <w:rPr>
+          <w:rFonts w:ascii="Arial" w:cs="Arial" w:eastAsia="Arial" w:hAnsi="Arial"/>
+          <w:sz w:val="22"/>
+          <w:szCs w:val="22"/>
+        </w:rPr>
+        <w:t xml:space="preserve">Two reference foundations documents in docs/: genrou_physical_foundations.md (what each parameter physically represents — Xd/X'd/X"d hierarchy, T'do/T"do as L/R of rotor windings, etc.) and network_machine_interface.md (how the simulator stitches per-machine dq dynamics to the network DQ algebraic solve, with Norton augmentation and rotation operators). Read these before any model-specific code.</w:t>
       </w:r>
     </w:p>
     <w:p>

</xml_diff>

<commit_message>
Phase 2.3 shipped — GENROU + ST1A + PSS1A + TGOV1 (model, simulator, tests, notebook, PSSE benchmark)
- smib/models/tgov1.py: 2-state TGOV1 (droop, non-windup valve servo, reheat lead-lag)
- run_smib_genrou_avr_pss_gov(): 11-state harness; Pm now a live signal
- grid_frequency_ramp_schedule(): composable infinite-bus angle-ramp frequency events
- tests/test_tgov1.py: 5/5 (flatline, init, droop SS, gov-locked CCT, valve anti-windup); suite 33/33
- notebooks/phase2_3_governor.ipynb: 24 cells, executed; droop line measured R=0.0501
- psse/phase2_3/: dyr + psspy script + reference numbers
- CCT 326->333 ms (+6.4 ms, helpful direction only); classical plant stack complete
</commit_message>
<xml_diff>
--- a/SMIB_Master_Plan.docx
+++ b/SMIB_Master_Plan.docx
@@ -1233,6 +1233,19 @@
           <w:szCs w:val="22"/>
         </w:rPr>
         <w:t xml:space="preserve">Ship a PSSE benchmark for every phase. Each phase delivers a psse/phaseN/ folder with (a) a .dyr dynamics file in PSSE syntax, (b) a psspy automation script run_phaseN_fault.py driving the same disturbance the smib notebook simulates, and (c) a README with GUI + psspy instructions and a table of smib reference numbers (V from PF, |E'|, peak swing, mid-fault P/Q, CCT). Expected agreement: ~3 % on all canonical traces with matched step size (smib h = 2 ms, PSSE DELT = 0.002). Purposes: (i) correctness floor — disagreement between smib and PSSE points at exactly which model/init/integrator detail to debug; (ii) pedagogical confidence — colleagues trust PSSE, so smib reproducing it lets them trust smib too, then use smib as a transparent way to understand what PSSE is doing under the hood. See psse/phase1/ as the template.</w:t>
+      </w:r>
+    </w:p>
+    <w:p>
+      <w:pPr>
+        <w:pStyle w:val="ListParagraph"/>
+        <w:numPr>
+          <w:ilvl w:val="0"/>
+          <w:numId w:val="2"/>
+        </w:numPr>
+        <w:spacing w:after="80"/>
+      </w:pPr>
+      <w:r>
+        <w:t>Plan an open-source equation-based companion benchmark for Phase 3 onward (Dynawo). Once Phase 3 IBR models land, add a sibling dynawo/phase3/ folder using the same template as psse/phaseN/: one input deck (.iidm/.par/.dyd), one run script, one README with smib reference numbers. Dynawo (RTE + AIA) is Modelica-based, so its IBR libraries are readable — making it the natural complement to PSSE when REGC_A/REEC_A/REPC_A/REGFM_A1 start mattering and PSSE alone is unsatisfying. Use it for three things: (i) independent tie-breaker if smib and PSSE disagree on an IBR case; (ii) read-the-equations cross-check on IBR limit logic that PSSE hides; (iii) credible reference for colleagues without a PSSE license. Do not retrofit Dynawo for Phase 1/2 — smib + PSSE is the right correctness floor for classical machines. VeraGrid (née GridCal) is intentionally left out of the benchmark stack: excellent for bulk-system planning workflows, but its transient-stability solver is less mature and its DAE is not exposed the way Modelica's is, so it adds neither correctness floor nor pedagogical transparency beyond smib + PSSE + Dynawo. Revisit only if smib outgrows SMIB into multi-bus territory (Phase 5+).</w:t>
       </w:r>
     </w:p>
     <w:p>
@@ -2400,7 +2413,7 @@
           <w:sz w:val="22"/>
           <w:szCs w:val="22"/>
         </w:rPr>
-        <w:t xml:space="preserve">Updated as phases land. As of the latest build, Phase 1 is fully shipped (model + tests + notebook + PSSE benchmark), and Phase 2 is in flight at sub-increment 2.0 (GENROU bare). The four sub-phases of Phase 2 land independently, each adding one controller on top of the round-rotor machine.</w:t>
+        <w:t>Updated as phases land.  As of the latest build, Phase 1 is fully shipped, and Phase 2 is COMPLETE through all four sub-increments: 2.0 GENROU bare, 2.1 + ST1A AVR, 2.2 + PSS1A, and 2.3 + TGOV1 (model + tests + notebook + PSSE benchmark each).  The classical synchronous plant stack is done.  Phase 2.3 headlines: droop steady state exact (measured R = 0.0500 vs design 0.05; a -0.2 Hz grid event via the infinite-bus angle ramp settles rotor slip at -0.004 pu and lifts Pm by +0.080 pu = -dw/R), valve non-windup limit verified (pins at Vmax, releases cleanly on recovery), and CCT moves only +6 ms (326 to 333 ms) in the helpful direction — the bounded result the time-scale argument predicts.  The full test suite stands at 33/33.  Next: Phase 3 (generic IBR — REGC_A + REEC_A + REPC_A on the existing MHI-anchored PLL), including the Dynawo companion benchmark folder.</w:t>
       </w:r>
     </w:p>
     <w:tbl>
@@ -5604,6 +5617,19 @@
           <w:szCs w:val="22"/>
         </w:rPr>
         <w:t xml:space="preserve">SCR sweep from 10 down to 1.5 with ibr_fast → instability onset. Re-run with bulk_AC → instability disappears. That overlay is the headline plot of Phase 3.</w:t>
+      </w:r>
+    </w:p>
+    <w:p>
+      <w:pPr>
+        <w:pStyle w:val="ListParagraph"/>
+        <w:numPr>
+          <w:ilvl w:val="0"/>
+          <w:numId w:val="2"/>
+        </w:numPr>
+        <w:spacing w:after="80"/>
+      </w:pPr>
+      <w:r>
+        <w:t>Deliverables additionally include a dynawo/phase3/ folder mirroring the psse/phase3/ template. The Dynawo run is the open-source, equation-based half of the Phase 3 correctness floor — if smib, PSSE, and Dynawo all agree on the SCR sweep instability onset within tolerance, the IBR stack is trusted. If two agree and one diverges, the diverger is the bug.</w:t>
       </w:r>
     </w:p>
     <w:p>

</xml_diff>